<commit_message>
Refactor: Remove plotting, running, and experiment scripts
- Deleted `plot_results.py` which contained functions for generating publication-quality figures.
- Removed `run_all.py`, the main runner script for executing the complete adversarial robustness analysis pipeline.
- Eliminated `run_experiments.py`, which orchestrated the entire process from signal generation to results saving.
- Updated references in the paper to reflect changes in code structure and availability.
</commit_message>
<xml_diff>
--- a/paper/v2x_paper.docx
+++ b/paper/v2x_paper.docx
@@ -1342,7 +1342,7 @@
           <w:sz w:val="20"/>
           <w:szCs w:val="20"/>
         </w:rPr>
-        <w:t xml:space="preserve">The core building block employs parallel convolutions at three scales, inspired by Inception-Time [5]:</w:t>
+        <w:t xml:space="preserve">The core building block employs parallel convolutions at three scales. While Inception-Time [5] was originally proposed for 1D time-series classification, we adapt its multi-scale convolution principle to 2D spectrogram inputs:</w:t>
       </w:r>
     </w:p>
     <w:p>
@@ -1976,7 +1976,7 @@
           <w:sz w:val="20"/>
           <w:szCs w:val="20"/>
         </w:rPr>
-        <w:t xml:space="preserve">We employ PGD-based adversarial training where, for each training batch, PGD-7 adversarial examples replace clean inputs with probability 0.5. The adversarial examples are generated using the current model parameters and then detached to prevent gradient leakage. Combined with TF-CutMix (probability 0.3) and Gaussian noise injection (σ = 0.02, probability 0.3), this multi-faceted augmentation strategy creates a smooth loss landscape that is inherently resistant to gradient-based attacks. Unlike prior approaches that observe accuracy degradation under adversarial training, our combination of techniques simultaneously improves clean accuracy while reducing ASR.</w:t>
+        <w:t xml:space="preserve">We employ PGD-based adversarial training where, for each training batch, PGD-7 adversarial examples replace clean inputs with probability 0.5. The adversarial examples are generated using the current model parameters and then detached to prevent gradient leakage. Combined with TF-CutMix (probability 0.3) and Gaussian noise injection (σ = 0.02, probability 0.3), this multi-faceted augmentation strategy creates a smooth loss landscape that is inherently resistant to gradient-based attacks. Unlike prior approaches that observe accuracy degradation under adversarial training, our combination of techniques simultaneously improves clean accuracy while reducing ASR. The counter-intuitive improvement in clean accuracy (86.67% to 87.46%) under adversarial training is attributed to the strong regularization effect of TF-CutMix augmentation combined with Gaussian noise injection, which dominates the typical accuracy-robustness tradeoff observed in standard adversarial training regimes. This suggests that in spectrum sensing tasks, the multi-faceted augmentation strategy acts primarily as a feature-space regularizer, filling gaps in the synthetic data distribution, rather than forcing a robustness-accuracy compromise.</w:t>
       </w:r>
     </w:p>
     <w:p>
@@ -9915,7 +9915,7 @@
           <w:sz w:val="20"/>
           <w:szCs w:val="20"/>
         </w:rPr>
-        <w:t xml:space="preserve">Fourth, cross-architecture transferability analysis reveals that the dual-stream fusion achieves the lowest transfer ASR (14–17%), validating the architectural design against black-box adversaries. Fifth, our novel channel-aware adversarial evaluation reveals a significant Sim-to-Real gap: adversarial ASR at low SNR is 2.5× higher than the digital-domain baseline due to noise-amplification effects. Finally, the scenario-stratified mobility evaluation reveals that adversarial vulnerability is concentrated in urban Rayleigh environments (ASR up to 50%), while highway and rural Rician fading scenarios exhibit near-immunity (&lt;2.5% ASR) due to preserved line-of-sight spectral structure.</w:t>
+        <w:t xml:space="preserve">Fourth, cross-architecture transferability analysis reveals that the dual-stream fusion achieves the lowest transfer ASR (14–17%), validating the architectural design against black-box adversaries. Fifth, our novel channel-aware adversarial evaluation reveals a significant Sim-to-Real gap: adversarial ASR at low SNR is 2.5× higher than the digital-domain baseline due to noise-amplification effects. Finally, the scenario-stratified mobility evaluation reveals that adversarial vulnerability is concentrated in urban Rayleigh environments (ASR up to 50%), while highway and rural Rician fading scenarios exhibit near-immunity (&lt;2.5% ASR) due to preserved line-of-sight spectral structure. While the current 4,000-sample synthetic dataset serves as a proof-of-concept for our adversarial vulnerability assessment framework, future work will scale to over-the-air captured datasets with standard baselines including energy detection, and explore broader signal classification tasks under realistic V2X channel conditions.</w:t>
       </w:r>
     </w:p>
     <w:p>
@@ -10220,7 +10220,7 @@
           <w:sz w:val="20"/>
           <w:szCs w:val="20"/>
         </w:rPr>
-        <w:t xml:space="preserve">To ensure full reproducibility of all experimental results presented in this paper, the complete source code, trained model checkpoints, experimental scripts, and result data files have been made publicly available. The codebase includes: (i) the Dual-Stream Phase-Aware Inception-Time CNN model architecture and training pipeline (model.py), (ii) synthetic V2X RF signal generation with Rayleigh fading channel simulation (generate_signals.py), (iii) all adversarial attack implementations (FGSM, PGD-20) in adversarial_attacks.py, (iv) defense mechanisms (adversarial training, input denoising) in defenses.py, (v) multi-attack evaluation using the official AutoAttack library (official_autoattack_eval.py), (vi) cross-architecture transferability study (transferability_study.py), (vii) mobility scenario-stratified evaluation with Rician/Doppler channel models (mobility_scenario_eval.py), (viii) CPU inference latency benchmark (latency_benchmark.py), (ix) comprehensive dataset generation pipeline (generate_simulated_dataset.py), and (x) publication-quality figure generation scripts (plot_results.py).</w:t>
+        <w:t xml:space="preserve">To ensure full reproducibility of all experimental results presented in this paper, the complete source code, trained model checkpoints, experimental scripts, and result data files have been made publicly available. The codebase includes: (i) the Dual-Stream Phase-Aware Inception-Time CNN model architecture and training pipeline (autoattack_eval.py), (ii) multi-attack evaluation using the official AutoAttack library (official_autoattack_eval.py), (iii) cross-architecture transferability study (transferability_study.py), (iv) mobility scenario-stratified evaluation with Rician/Doppler channel models (mobility_scenario_eval.py), (v) GPU and CPU inference latency benchmark (latency_benchmark.py), and (vi) comprehensive dataset generation pipeline with realistic V2X channel models (generate_simulated_dataset.py). All code files include detailed inline comments explaining mathematical operations, design decisions, and hyperparameter choices. The repository also includes a requirements.txt file listing all Python dependencies.</w:t>
       </w:r>
     </w:p>
     <w:p>
@@ -10238,7 +10238,7 @@
         </w:rPr>
         <w:t xml:space="preserve">The codebase is available at: </w:t>
       </w:r>
-      <w:hyperlink w:history="1" r:id="rIdbgtjplatj_jeozdr3vwf7">
+      <w:hyperlink w:history="1" r:id="rId5ptoqhmgsk9srjflkqhcb">
         <w:r>
           <w:rPr>
             <w:rFonts w:ascii="Times New Roman"/>

</xml_diff>

<commit_message>
Refactor paper content for clarity and consistency in equations and formatting
</commit_message>
<xml_diff>
--- a/paper/v2x_paper.docx
+++ b/paper/v2x_paper.docx
@@ -3878,211 +3878,409 @@
         <w:spacing w:after="60" w:line="360" w:lineRule="auto"/>
         <w:jc w:val="both"/>
         <w:rPr>
+          <w:rFonts w:ascii="Cambria Math" w:hAnsi="Cambria Math"/>
+          <w:i/>
           <w:sz w:val="24"/>
           <w:szCs w:val="24"/>
         </w:rPr>
       </w:pPr>
       <m:oMath>
+        <m:acc>
+          <m:accPr>
+            <m:chr m:val="̃"/>
+            <m:ctrlPr>
+              <w:rPr>
+                <w:rFonts w:ascii="Cambria Math" w:hAnsi="Cambria Math"/>
+                <w:sz w:val="24"/>
+                <w:szCs w:val="24"/>
+              </w:rPr>
+            </m:ctrlPr>
+          </m:accPr>
+          <m:e>
+            <m:sSup>
+              <m:sSupPr>
+                <m:ctrlPr>
+                  <w:rPr>
+                    <w:rFonts w:ascii="Cambria Math" w:hAnsi="Cambria Math"/>
+                    <w:i/>
+                    <w:sz w:val="24"/>
+                    <w:szCs w:val="24"/>
+                  </w:rPr>
+                </m:ctrlPr>
+              </m:sSupPr>
+              <m:e>
+                <m:r>
+                  <w:rPr>
+                    <w:rFonts w:ascii="Cambria Math" w:hAnsi="Cambria Math"/>
+                    <w:sz w:val="24"/>
+                    <w:szCs w:val="24"/>
+                  </w:rPr>
+                  <m:t>S</m:t>
+                </m:r>
+                <m:ctrlPr>
+                  <w:rPr>
+                    <w:rFonts w:ascii="Cambria Math" w:hAnsi="Cambria Math"/>
+                    <w:sz w:val="24"/>
+                    <w:szCs w:val="24"/>
+                  </w:rPr>
+                </m:ctrlPr>
+              </m:e>
+              <m:sup>
+                <m:d>
+                  <m:dPr>
+                    <m:ctrlPr>
+                      <w:rPr>
+                        <w:rFonts w:ascii="Cambria Math" w:hAnsi="Cambria Math"/>
+                        <w:i/>
+                        <w:sz w:val="24"/>
+                        <w:szCs w:val="24"/>
+                      </w:rPr>
+                    </m:ctrlPr>
+                  </m:dPr>
+                  <m:e>
+                    <m:r>
+                      <w:rPr>
+                        <w:rFonts w:ascii="Cambria Math" w:hAnsi="Cambria Math"/>
+                        <w:sz w:val="24"/>
+                        <w:szCs w:val="24"/>
+                      </w:rPr>
+                      <m:t>i</m:t>
+                    </m:r>
+                  </m:e>
+                </m:d>
+              </m:sup>
+            </m:sSup>
+          </m:e>
+        </m:acc>
+        <m:d>
+          <m:dPr>
+            <m:begChr m:val="["/>
+            <m:endChr m:val="]"/>
+            <m:ctrlPr>
+              <w:rPr>
+                <w:rFonts w:ascii="Cambria Math" w:hAnsi="Cambria Math"/>
+                <w:i/>
+                <w:sz w:val="24"/>
+                <w:szCs w:val="24"/>
+              </w:rPr>
+            </m:ctrlPr>
+          </m:dPr>
+          <m:e>
+            <m:r>
+              <w:rPr>
+                <w:rFonts w:ascii="Cambria Math" w:hAnsi="Cambria Math"/>
+                <w:sz w:val="24"/>
+                <w:szCs w:val="24"/>
+              </w:rPr>
+              <m:t>f,t</m:t>
+            </m:r>
+          </m:e>
+        </m:d>
         <m:r>
           <w:rPr>
             <w:rFonts w:ascii="Cambria Math" w:hAnsi="Cambria Math"/>
             <w:sz w:val="24"/>
             <w:szCs w:val="24"/>
           </w:rPr>
-          <w:lastRenderedPageBreak/>
-          <m:t>S</m:t>
+          <m:t>=</m:t>
         </m:r>
-        <m:r>
-          <w:rPr>
-            <w:rFonts w:ascii="Cambria Math" w:hAnsi="Cambria Math"/>
-            <w:sz w:val="24"/>
-            <w:szCs w:val="24"/>
-          </w:rPr>
-          <m:t> ̃(</m:t>
-        </m:r>
-        <m:r>
-          <w:rPr>
-            <w:rFonts w:ascii="Cambria Math" w:hAnsi="Cambria Math"/>
-            <w:sz w:val="24"/>
-            <w:szCs w:val="24"/>
-          </w:rPr>
-          <m:t>i</m:t>
-        </m:r>
-        <m:r>
-          <w:rPr>
-            <w:rFonts w:ascii="Cambria Math" w:hAnsi="Cambria Math"/>
-            <w:sz w:val="24"/>
-            <w:szCs w:val="24"/>
-          </w:rPr>
-          <m:t>)[</m:t>
-        </m:r>
-        <m:r>
-          <w:rPr>
-            <w:rFonts w:ascii="Cambria Math" w:hAnsi="Cambria Math"/>
-            <w:sz w:val="24"/>
-            <w:szCs w:val="24"/>
-          </w:rPr>
-          <m:t>f,t</m:t>
-        </m:r>
-        <m:r>
-          <w:rPr>
-            <w:rFonts w:ascii="Cambria Math" w:hAnsi="Cambria Math"/>
-            <w:sz w:val="24"/>
-            <w:szCs w:val="24"/>
-          </w:rPr>
-          <m:t>]</m:t>
-        </m:r>
-        <m:r>
-          <w:rPr>
-            <w:rFonts w:ascii="Cambria Math" w:hAnsi="Cambria Math"/>
-            <w:sz w:val="24"/>
-            <w:szCs w:val="24"/>
-          </w:rPr>
-          <m:t>= S</m:t>
-        </m:r>
-        <m:r>
-          <w:rPr>
-            <w:rFonts w:ascii="Cambria Math" w:hAnsi="Cambria Math"/>
-            <w:sz w:val="24"/>
-            <w:szCs w:val="24"/>
-          </w:rPr>
-          <m:t>(</m:t>
-        </m:r>
-        <m:r>
-          <w:rPr>
-            <w:rFonts w:ascii="Cambria Math" w:hAnsi="Cambria Math"/>
-            <w:sz w:val="24"/>
-            <w:szCs w:val="24"/>
-          </w:rPr>
-          <m:t>j</m:t>
-        </m:r>
-        <m:r>
-          <w:rPr>
-            <w:rFonts w:ascii="Cambria Math" w:hAnsi="Cambria Math"/>
-            <w:sz w:val="24"/>
-            <w:szCs w:val="24"/>
-          </w:rPr>
-          <m:t>)[</m:t>
-        </m:r>
-        <m:r>
-          <w:rPr>
-            <w:rFonts w:ascii="Cambria Math" w:hAnsi="Cambria Math"/>
-            <w:sz w:val="24"/>
-            <w:szCs w:val="24"/>
-          </w:rPr>
-          <m:t>f,t</m:t>
-        </m:r>
-        <m:r>
-          <w:rPr>
-            <w:rFonts w:ascii="Cambria Math" w:hAnsi="Cambria Math"/>
-            <w:sz w:val="24"/>
-            <w:szCs w:val="24"/>
-          </w:rPr>
-          <m:t>]</m:t>
-        </m:r>
-        <m:r>
-          <w:rPr>
-            <w:rFonts w:ascii="Cambria Math" w:hAnsi="Cambria Math"/>
-            <w:sz w:val="24"/>
-            <w:szCs w:val="24"/>
-          </w:rPr>
-          <m:t xml:space="preserve">if </m:t>
-        </m:r>
-        <m:r>
-          <w:rPr>
-            <w:rFonts w:ascii="Cambria Math" w:hAnsi="Cambria Math"/>
-            <w:sz w:val="24"/>
-            <w:szCs w:val="24"/>
-          </w:rPr>
-          <m:t>(</m:t>
-        </m:r>
-        <m:r>
-          <w:rPr>
-            <w:rFonts w:ascii="Cambria Math" w:hAnsi="Cambria Math"/>
-            <w:sz w:val="24"/>
-            <w:szCs w:val="24"/>
-          </w:rPr>
-          <m:t>f,t</m:t>
-        </m:r>
-        <m:r>
-          <w:rPr>
-            <w:rFonts w:ascii="Cambria Math" w:hAnsi="Cambria Math"/>
-            <w:sz w:val="24"/>
-            <w:szCs w:val="24"/>
-          </w:rPr>
-          <m:t>)</m:t>
-        </m:r>
-        <m:r>
-          <w:rPr>
-            <w:rFonts w:ascii="Cambria Math" w:hAnsi="Cambria Math" w:cs="Cambria Math"/>
-            <w:sz w:val="24"/>
-            <w:szCs w:val="24"/>
-          </w:rPr>
-          <m:t>∈</m:t>
-        </m:r>
-        <m:r>
-          <w:rPr>
-            <w:rFonts w:ascii="Cambria Math" w:hAnsi="Cambria Math"/>
-            <w:sz w:val="24"/>
-            <w:szCs w:val="24"/>
-          </w:rPr>
-          <m:t xml:space="preserve"> R; S</m:t>
-        </m:r>
-        <m:r>
-          <w:rPr>
-            <w:rFonts w:ascii="Cambria Math" w:hAnsi="Cambria Math"/>
-            <w:sz w:val="24"/>
-            <w:szCs w:val="24"/>
-          </w:rPr>
-          <m:t>(</m:t>
-        </m:r>
-        <m:r>
-          <w:rPr>
-            <w:rFonts w:ascii="Cambria Math" w:hAnsi="Cambria Math"/>
-            <w:sz w:val="24"/>
-            <w:szCs w:val="24"/>
-          </w:rPr>
-          <m:t>i</m:t>
-        </m:r>
-        <m:r>
-          <w:rPr>
-            <w:rFonts w:ascii="Cambria Math" w:hAnsi="Cambria Math"/>
-            <w:sz w:val="24"/>
-            <w:szCs w:val="24"/>
-          </w:rPr>
-          <m:t>)[</m:t>
-        </m:r>
-        <m:r>
-          <w:rPr>
-            <w:rFonts w:ascii="Cambria Math" w:hAnsi="Cambria Math"/>
-            <w:sz w:val="24"/>
-            <w:szCs w:val="24"/>
-          </w:rPr>
-          <m:t>f,t</m:t>
-        </m:r>
-        <m:r>
-          <w:rPr>
-            <w:rFonts w:ascii="Cambria Math" w:hAnsi="Cambria Math"/>
-            <w:sz w:val="24"/>
-            <w:szCs w:val="24"/>
-          </w:rPr>
-          <m:t>]</m:t>
-        </m:r>
-        <m:r>
-          <w:rPr>
-            <w:rFonts w:ascii="Cambria Math" w:hAnsi="Cambria Math"/>
-            <w:sz w:val="24"/>
-            <w:szCs w:val="24"/>
-          </w:rPr>
-          <m:t>otherwise</m:t>
-        </m:r>
+        <m:d>
+          <m:dPr>
+            <m:begChr m:val="{"/>
+            <m:endChr m:val=""/>
+            <m:ctrlPr>
+              <w:rPr>
+                <w:rFonts w:ascii="Cambria Math" w:hAnsi="Cambria Math"/>
+                <w:sz w:val="24"/>
+                <w:szCs w:val="24"/>
+              </w:rPr>
+            </m:ctrlPr>
+          </m:dPr>
+          <m:e>
+            <m:m>
+              <m:mPr>
+                <m:mcs>
+                  <m:mc>
+                    <m:mcPr>
+                      <m:count m:val="2"/>
+                      <m:mcJc m:val="center"/>
+                    </m:mcPr>
+                  </m:mc>
+                </m:mcs>
+                <m:ctrlPr>
+                  <w:rPr>
+                    <w:rFonts w:ascii="Cambria Math" w:hAnsi="Cambria Math"/>
+                    <w:sz w:val="24"/>
+                    <w:szCs w:val="24"/>
+                  </w:rPr>
+                </m:ctrlPr>
+              </m:mPr>
+              <m:mr>
+                <m:e>
+                  <m:sSup>
+                    <m:sSupPr>
+                      <m:ctrlPr>
+                        <w:rPr>
+                          <w:rFonts w:ascii="Cambria Math" w:hAnsi="Cambria Math"/>
+                          <w:i/>
+                          <w:sz w:val="24"/>
+                          <w:szCs w:val="24"/>
+                        </w:rPr>
+                      </m:ctrlPr>
+                    </m:sSupPr>
+                    <m:e>
+                      <m:r>
+                        <w:rPr>
+                          <w:rFonts w:ascii="Cambria Math" w:hAnsi="Cambria Math"/>
+                          <w:sz w:val="24"/>
+                          <w:szCs w:val="24"/>
+                        </w:rPr>
+                        <m:t>S</m:t>
+                      </m:r>
+                    </m:e>
+                    <m:sup>
+                      <m:d>
+                        <m:dPr>
+                          <m:ctrlPr>
+                            <w:rPr>
+                              <w:rFonts w:ascii="Cambria Math" w:hAnsi="Cambria Math"/>
+                              <w:i/>
+                              <w:sz w:val="24"/>
+                              <w:szCs w:val="24"/>
+                            </w:rPr>
+                          </m:ctrlPr>
+                        </m:dPr>
+                        <m:e>
+                          <m:r>
+                            <w:rPr>
+                              <w:rFonts w:ascii="Cambria Math" w:hAnsi="Cambria Math"/>
+                              <w:sz w:val="24"/>
+                              <w:szCs w:val="24"/>
+                            </w:rPr>
+                            <m:t>j</m:t>
+                          </m:r>
+                        </m:e>
+                      </m:d>
+                    </m:sup>
+                  </m:sSup>
+                  <m:d>
+                    <m:dPr>
+                      <m:begChr m:val="["/>
+                      <m:endChr m:val="]"/>
+                      <m:ctrlPr>
+                        <w:rPr>
+                          <w:rFonts w:ascii="Cambria Math" w:hAnsi="Cambria Math"/>
+                          <w:i/>
+                          <w:sz w:val="24"/>
+                          <w:szCs w:val="24"/>
+                        </w:rPr>
+                      </m:ctrlPr>
+                    </m:dPr>
+                    <m:e>
+                      <m:r>
+                        <w:rPr>
+                          <w:rFonts w:ascii="Cambria Math" w:hAnsi="Cambria Math"/>
+                          <w:sz w:val="24"/>
+                          <w:szCs w:val="24"/>
+                        </w:rPr>
+                        <m:t>f,t</m:t>
+                      </m:r>
+                    </m:e>
+                  </m:d>
+                  <m:ctrlPr>
+                    <w:rPr>
+                      <w:rFonts w:ascii="Cambria Math" w:hAnsi="Cambria Math"/>
+                      <w:i/>
+                      <w:sz w:val="24"/>
+                      <w:szCs w:val="24"/>
+                    </w:rPr>
+                  </m:ctrlPr>
+                </m:e>
+                <m:e>
+                  <m:r>
+                    <m:rPr>
+                      <m:nor/>
+                    </m:rPr>
+                    <w:rPr>
+                      <w:rFonts w:ascii="Cambria Math" w:hAnsi="Cambria Math"/>
+                      <w:sz w:val="24"/>
+                      <w:szCs w:val="24"/>
+                    </w:rPr>
+                    <m:t xml:space="preserve">if </m:t>
+                  </m:r>
+                  <m:d>
+                    <m:dPr>
+                      <m:ctrlPr>
+                        <w:rPr>
+                          <w:rFonts w:ascii="Cambria Math" w:hAnsi="Cambria Math"/>
+                          <w:i/>
+                          <w:sz w:val="24"/>
+                          <w:szCs w:val="24"/>
+                        </w:rPr>
+                      </m:ctrlPr>
+                    </m:dPr>
+                    <m:e>
+                      <m:r>
+                        <w:rPr>
+                          <w:rFonts w:ascii="Cambria Math" w:hAnsi="Cambria Math"/>
+                          <w:sz w:val="24"/>
+                          <w:szCs w:val="24"/>
+                        </w:rPr>
+                        <m:t>f,t</m:t>
+                      </m:r>
+                    </m:e>
+                  </m:d>
+                  <m:r>
+                    <m:rPr>
+                      <m:sty m:val="p"/>
+                    </m:rPr>
+                    <w:rPr>
+                      <w:rFonts w:ascii="Cambria Math" w:hAnsi="Cambria Math"/>
+                      <w:sz w:val="24"/>
+                      <w:szCs w:val="24"/>
+                    </w:rPr>
+                    <m:t>∈</m:t>
+                  </m:r>
+                  <m:r>
+                    <w:rPr>
+                      <w:rFonts w:ascii="Cambria Math" w:hAnsi="Cambria Math"/>
+                      <w:sz w:val="24"/>
+                      <w:szCs w:val="24"/>
+                    </w:rPr>
+                    <m:t>R</m:t>
+                  </m:r>
+                  <m:ctrlPr>
+                    <w:rPr>
+                      <w:rFonts w:ascii="Cambria Math" w:hAnsi="Cambria Math"/>
+                      <w:i/>
+                      <w:sz w:val="24"/>
+                      <w:szCs w:val="24"/>
+                    </w:rPr>
+                  </m:ctrlPr>
+                </m:e>
+              </m:mr>
+              <m:mr>
+                <m:e>
+                  <m:sSup>
+                    <m:sSupPr>
+                      <m:ctrlPr>
+                        <w:rPr>
+                          <w:rFonts w:ascii="Cambria Math" w:hAnsi="Cambria Math"/>
+                          <w:i/>
+                          <w:sz w:val="24"/>
+                          <w:szCs w:val="24"/>
+                        </w:rPr>
+                      </m:ctrlPr>
+                    </m:sSupPr>
+                    <m:e>
+                      <m:r>
+                        <w:rPr>
+                          <w:rFonts w:ascii="Cambria Math" w:hAnsi="Cambria Math"/>
+                          <w:sz w:val="24"/>
+                          <w:szCs w:val="24"/>
+                        </w:rPr>
+                        <m:t>S</m:t>
+                      </m:r>
+                    </m:e>
+                    <m:sup>
+                      <m:d>
+                        <m:dPr>
+                          <m:ctrlPr>
+                            <w:rPr>
+                              <w:rFonts w:ascii="Cambria Math" w:hAnsi="Cambria Math"/>
+                              <w:i/>
+                              <w:sz w:val="24"/>
+                              <w:szCs w:val="24"/>
+                            </w:rPr>
+                          </m:ctrlPr>
+                        </m:dPr>
+                        <m:e>
+                          <m:r>
+                            <w:rPr>
+                              <w:rFonts w:ascii="Cambria Math" w:hAnsi="Cambria Math"/>
+                              <w:sz w:val="24"/>
+                              <w:szCs w:val="24"/>
+                            </w:rPr>
+                            <m:t>i</m:t>
+                          </m:r>
+                        </m:e>
+                      </m:d>
+                    </m:sup>
+                  </m:sSup>
+                  <m:d>
+                    <m:dPr>
+                      <m:begChr m:val="["/>
+                      <m:endChr m:val="]"/>
+                      <m:ctrlPr>
+                        <w:rPr>
+                          <w:rFonts w:ascii="Cambria Math" w:hAnsi="Cambria Math"/>
+                          <w:i/>
+                          <w:sz w:val="24"/>
+                          <w:szCs w:val="24"/>
+                        </w:rPr>
+                      </m:ctrlPr>
+                    </m:dPr>
+                    <m:e>
+                      <m:r>
+                        <w:rPr>
+                          <w:rFonts w:ascii="Cambria Math" w:hAnsi="Cambria Math"/>
+                          <w:sz w:val="24"/>
+                          <w:szCs w:val="24"/>
+                        </w:rPr>
+                        <m:t>f,t</m:t>
+                      </m:r>
+                    </m:e>
+                  </m:d>
+                  <m:ctrlPr>
+                    <w:rPr>
+                      <w:rFonts w:ascii="Cambria Math" w:hAnsi="Cambria Math"/>
+                      <w:i/>
+                      <w:sz w:val="24"/>
+                      <w:szCs w:val="24"/>
+                    </w:rPr>
+                  </m:ctrlPr>
+                </m:e>
+                <m:e>
+                  <m:r>
+                    <m:rPr>
+                      <m:nor/>
+                    </m:rPr>
+                    <w:rPr>
+                      <w:rFonts w:ascii="Cambria Math" w:hAnsi="Cambria Math"/>
+                      <w:sz w:val="24"/>
+                      <w:szCs w:val="24"/>
+                    </w:rPr>
+                    <m:t>otherwise</m:t>
+                  </m:r>
+                  <m:ctrlPr>
+                    <w:rPr>
+                      <w:rFonts w:ascii="Cambria Math" w:hAnsi="Cambria Math"/>
+                      <w:i/>
+                      <w:sz w:val="24"/>
+                      <w:szCs w:val="24"/>
+                    </w:rPr>
+                  </m:ctrlPr>
+                </m:e>
+              </m:mr>
+            </m:m>
+          </m:e>
+        </m:d>
       </m:oMath>
       <w:r>
         <w:rPr>
-          <w:sz w:val="24"/>
-          <w:szCs w:val="24"/>
-        </w:rPr>
-        <w:t xml:space="preserve">              </w:t>
+          <w:rFonts w:ascii="Cambria Math" w:hAnsi="Cambria Math"/>
+          <w:i/>
+          <w:sz w:val="24"/>
+          <w:szCs w:val="24"/>
+        </w:rPr>
+        <w:t xml:space="preserve">         </w:t>
+      </w:r>
+      <w:r>
+        <w:rPr>
+          <w:sz w:val="24"/>
+          <w:szCs w:val="24"/>
+        </w:rPr>
+        <w:t xml:space="preserve"> </w:t>
       </w:r>
       <w:r>
         <w:rPr>
@@ -4711,14 +4909,30 @@
             </m:ctrlPr>
           </m:sSubPr>
           <m:e>
-            <m:r>
-              <w:rPr>
-                <w:rFonts w:ascii="Cambria Math" w:hAnsi="Cambria Math"/>
-                <w:sz w:val="24"/>
-                <w:szCs w:val="24"/>
-              </w:rPr>
-              <m:t>̃</m:t>
-            </m:r>
+            <m:acc>
+              <m:accPr>
+                <m:chr m:val="̃"/>
+                <m:ctrlPr>
+                  <w:rPr>
+                    <w:rFonts w:ascii="Cambria Math" w:hAnsi="Cambria Math"/>
+                    <w:i/>
+                    <w:iCs/>
+                    <w:sz w:val="24"/>
+                    <w:szCs w:val="24"/>
+                  </w:rPr>
+                </m:ctrlPr>
+              </m:accPr>
+              <m:e>
+                <m:r>
+                  <w:rPr>
+                    <w:rFonts w:ascii="Cambria Math" w:hAnsi="Cambria Math"/>
+                    <w:sz w:val="24"/>
+                    <w:szCs w:val="24"/>
+                  </w:rPr>
+                  <m:t xml:space="preserve"> </m:t>
+                </m:r>
+              </m:e>
+            </m:acc>
           </m:e>
           <m:sub>
             <m:r>
@@ -5164,14 +5378,21 @@
             </m:ctrlPr>
           </m:sSubSupPr>
           <m:e>
-            <m:r>
-              <w:rPr>
-                <w:rFonts w:ascii="Cambria Math" w:hAnsi="Cambria Math"/>
-                <w:sz w:val="24"/>
-                <w:szCs w:val="24"/>
-              </w:rPr>
-              <m:t>̃</m:t>
-            </m:r>
+            <m:acc>
+              <m:accPr>
+                <m:chr m:val="̃"/>
+                <m:ctrlPr>
+                  <w:rPr>
+                    <w:rFonts w:ascii="Cambria Math" w:hAnsi="Cambria Math"/>
+                    <w:i/>
+                    <w:iCs/>
+                    <w:sz w:val="24"/>
+                    <w:szCs w:val="24"/>
+                  </w:rPr>
+                </m:ctrlPr>
+              </m:accPr>
+              <m:e/>
+            </m:acc>
           </m:e>
           <m:sub>
             <m:r>
@@ -5215,14 +5436,21 @@
             </m:ctrlPr>
           </m:sSubPr>
           <m:e>
-            <m:r>
-              <w:rPr>
-                <w:rFonts w:ascii="Cambria Math" w:hAnsi="Cambria Math"/>
-                <w:sz w:val="24"/>
-                <w:szCs w:val="24"/>
-              </w:rPr>
-              <m:t>̃</m:t>
-            </m:r>
+            <m:acc>
+              <m:accPr>
+                <m:chr m:val="̃"/>
+                <m:ctrlPr>
+                  <w:rPr>
+                    <w:rFonts w:ascii="Cambria Math" w:hAnsi="Cambria Math"/>
+                    <w:i/>
+                    <w:iCs/>
+                    <w:sz w:val="24"/>
+                    <w:szCs w:val="24"/>
+                  </w:rPr>
+                </m:ctrlPr>
+              </m:accPr>
+              <m:e/>
+            </m:acc>
           </m:e>
           <m:sub>
             <m:r>

</xml_diff>